<commit_message>
Added link to Reports
Removed the pdf files because a link to the original report has been inserted into the Word Document
</commit_message>
<xml_diff>
--- a/Eurovision_Relazione.docx
+++ b/Eurovision_Relazione.docx
@@ -12,7 +12,6 @@
           <w:color w:val="6A1B7A"/>
           <w:sz w:val="40"/>
           <w:szCs w:val="40"/>
-          <w:lang w:val="en-US"/>
         </w:rPr>
       </w:pPr>
       <w:r>
@@ -22,7 +21,6 @@
           <w:color w:val="6A1B7A"/>
           <w:sz w:val="40"/>
           <w:szCs w:val="40"/>
-          <w:lang w:val="en-US"/>
         </w:rPr>
         <w:t>Eurovision Analysis</w:t>
       </w:r>
@@ -31,9 +29,6 @@
       <w:pPr>
         <w:spacing w:after="60"/>
         <w:jc w:val="center"/>
-        <w:rPr>
-          <w:lang w:val="en-US"/>
-        </w:rPr>
       </w:pPr>
       <w:r>
         <w:rPr>
@@ -42,10 +37,43 @@
           <w:color w:val="6A1B7A"/>
           <w:sz w:val="40"/>
           <w:szCs w:val="40"/>
-          <w:lang w:val="en-US"/>
-        </w:rPr>
-        <w:t>Data Preparation &amp; visualization</w:t>
-      </w:r>
+        </w:rPr>
+        <w:t xml:space="preserve">Data </w:t>
+      </w:r>
+      <w:proofErr w:type="spellStart"/>
+      <w:r>
+        <w:rPr>
+          <w:b/>
+          <w:bCs/>
+          <w:color w:val="6A1B7A"/>
+          <w:sz w:val="40"/>
+          <w:szCs w:val="40"/>
+        </w:rPr>
+        <w:t>Preparation</w:t>
+      </w:r>
+      <w:proofErr w:type="spellEnd"/>
+      <w:r>
+        <w:rPr>
+          <w:b/>
+          <w:bCs/>
+          <w:color w:val="6A1B7A"/>
+          <w:sz w:val="40"/>
+          <w:szCs w:val="40"/>
+        </w:rPr>
+        <w:t xml:space="preserve"> &amp; </w:t>
+      </w:r>
+      <w:proofErr w:type="spellStart"/>
+      <w:r>
+        <w:rPr>
+          <w:b/>
+          <w:bCs/>
+          <w:color w:val="6A1B7A"/>
+          <w:sz w:val="40"/>
+          <w:szCs w:val="40"/>
+        </w:rPr>
+        <w:t>visualization</w:t>
+      </w:r>
+      <w:proofErr w:type="spellEnd"/>
     </w:p>
     <w:p>
       <w:pPr>
@@ -63,17 +91,7 @@
           <w:sz w:val="24"/>
           <w:szCs w:val="24"/>
         </w:rPr>
-        <w:t>Relazione</w:t>
-      </w:r>
-      <w:r>
-        <w:rPr>
-          <w:i/>
-          <w:iCs/>
-          <w:color w:val="555555"/>
-          <w:sz w:val="24"/>
-          <w:szCs w:val="24"/>
-        </w:rPr>
-        <w:t xml:space="preserve"> sul lavoro svolto e sui risultati emersi</w:t>
+        <w:t>Relazione sul lavoro svolto e sui risultati emersi</w:t>
       </w:r>
     </w:p>
     <w:p>
@@ -81,6 +99,8 @@
         <w:pStyle w:val="Heading1"/>
         <w:jc w:val="both"/>
       </w:pPr>
+      <w:bookmarkStart w:id="0" w:name="_1._Obiettivo_dell'analisi"/>
+      <w:bookmarkEnd w:id="0"/>
       <w:r>
         <w:t>1. Obiettivo dell'analisi</w:t>
       </w:r>
@@ -91,8 +111,67 @@
         <w:jc w:val="both"/>
       </w:pPr>
       <w:r>
-        <w:t>L'analisi studia i risultati dell'Eurovision Song Contest dal 2016 al 2023, con un focus sul televoto: posizione finale, punti totali e punti di televoto. L'obiettivo principale è valutare la performance dell'Italia nel periodo e confrontarla con le altre nazioni partecipanti. Sono stati esclusi i dati di giuria e di sondaggio, non pertinenti alla domanda di ricerca.</w:t>
-      </w:r>
+        <w:t>L'analisi studia i risultati dell'Eurovision Song Contest dal 2016 al 2023</w:t>
+      </w:r>
+      <w:r>
+        <w:t xml:space="preserve">, </w:t>
+      </w:r>
+      <w:r>
+        <w:t xml:space="preserve">escluso il 2020 per </w:t>
+      </w:r>
+      <w:r>
+        <w:t xml:space="preserve">emergenza Covid-19 </w:t>
+      </w:r>
+      <w:r>
+        <w:t>(</w:t>
+      </w:r>
+      <w:r>
+        <w:t>contest annullato)</w:t>
+      </w:r>
+      <w:r>
+        <w:t>, con un focus sul televoto: posizione finale, punti totali e punti di televoto. L'obiettivo principale è valutare la performance dell'Italia nel periodo e confrontarla con le altre nazioni partecipanti. Sono stati esclusi i dati di giuria e di sondaggio, non pertinenti alla domanda di ricerca.</w:t>
+      </w:r>
+    </w:p>
+    <w:p>
+      <w:pPr>
+        <w:spacing w:after="120" w:line="276" w:lineRule="auto"/>
+        <w:jc w:val="both"/>
+      </w:pPr>
+    </w:p>
+    <w:p>
+      <w:pPr>
+        <w:shd w:val="clear" w:color="auto" w:fill="E8E8E8" w:themeFill="background2"/>
+        <w:spacing w:after="120" w:line="276" w:lineRule="auto"/>
+        <w:jc w:val="both"/>
+        <w:rPr>
+          <w:b/>
+          <w:bCs/>
+        </w:rPr>
+      </w:pPr>
+      <w:r>
+        <w:rPr>
+          <w:b/>
+          <w:bCs/>
+        </w:rPr>
+        <w:t>Il report completo interattivo è consultabile al seguente link:</w:t>
+      </w:r>
+    </w:p>
+    <w:p>
+      <w:pPr>
+        <w:shd w:val="clear" w:color="auto" w:fill="E8E8E8" w:themeFill="background2"/>
+        <w:spacing w:after="120" w:line="276" w:lineRule="auto"/>
+        <w:jc w:val="both"/>
+      </w:pPr>
+      <w:hyperlink r:id="rId5" w:history="1">
+        <w:proofErr w:type="spellStart"/>
+        <w:r>
+          <w:rPr>
+            <w:rStyle w:val="Hyperlink"/>
+          </w:rPr>
+          <w:t>Report_Eurovision_Analysis</w:t>
+        </w:r>
+        <w:proofErr w:type="spellEnd"/>
+      </w:hyperlink>
     </w:p>
     <w:p>
       <w:pPr>
@@ -141,56 +220,29 @@
       </w:r>
       <w:proofErr w:type="spellEnd"/>
       <w:r>
+        <w:t xml:space="preserve"> (con le nazioni ospitanti), </w:t>
+      </w:r>
+      <w:proofErr w:type="spellStart"/>
+      <w:r>
+        <w:t>country_data</w:t>
+      </w:r>
+      <w:proofErr w:type="spellEnd"/>
+      <w:r>
+        <w:t xml:space="preserve"> (con le aree geografiche) e </w:t>
+      </w:r>
+      <w:proofErr w:type="spellStart"/>
+      <w:r>
+        <w:t>song_data</w:t>
+      </w:r>
+      <w:proofErr w:type="spellEnd"/>
+      <w:r>
         <w:t xml:space="preserve"> (</w:t>
       </w:r>
       <w:r>
-        <w:t>con le nazioni ospitanti</w:t>
-      </w:r>
-      <w:r>
-        <w:t>),</w:t>
-      </w:r>
-      <w:r>
-        <w:t xml:space="preserve"> </w:t>
-      </w:r>
-      <w:proofErr w:type="spellStart"/>
-      <w:r>
-        <w:t>country_data</w:t>
-      </w:r>
-      <w:proofErr w:type="spellEnd"/>
-      <w:r>
-        <w:t xml:space="preserve"> </w:t>
-      </w:r>
-      <w:r>
-        <w:t>(</w:t>
-      </w:r>
-      <w:r>
-        <w:t>con le aree geografiche</w:t>
-      </w:r>
-      <w:r>
-        <w:t xml:space="preserve">) </w:t>
-      </w:r>
-      <w:r>
-        <w:t xml:space="preserve">e </w:t>
-      </w:r>
-      <w:proofErr w:type="spellStart"/>
-      <w:r>
-        <w:t>song_data</w:t>
-      </w:r>
-      <w:proofErr w:type="spellEnd"/>
-      <w:r>
-        <w:t xml:space="preserve"> (</w:t>
-      </w:r>
-      <w:r>
         <w:t xml:space="preserve">la più ampia, </w:t>
       </w:r>
       <w:r>
-        <w:t>con i dettagli di artisti e brani</w:t>
-      </w:r>
-      <w:r>
-        <w:t>)</w:t>
-      </w:r>
-      <w:r>
-        <w:t>.</w:t>
+        <w:t>con i dettagli di artisti e brani).</w:t>
       </w:r>
     </w:p>
     <w:p>
@@ -206,10 +258,7 @@
         <w:t xml:space="preserve">Nota sulla qualità dei dati: </w:t>
       </w:r>
       <w:r>
-        <w:t>I dati originari risultavano già ben strutturati quindi la fase di pulizia e trasformazione dati è stata minima</w:t>
-      </w:r>
-      <w:r>
-        <w:t xml:space="preserve"> ma </w:t>
+        <w:t xml:space="preserve">I dati originari risultavano già ben strutturati quindi la fase di pulizia e trasformazione dati è stata minima ma </w:t>
       </w:r>
       <w:r>
         <w:rPr>
@@ -402,19 +451,7 @@
       </w:r>
       <w:proofErr w:type="spellEnd"/>
       <w:r>
-        <w:t xml:space="preserve"> (</w:t>
-      </w:r>
-      <w:r>
-        <w:t xml:space="preserve">dal </w:t>
-      </w:r>
-      <w:r>
-        <w:t>2016</w:t>
-      </w:r>
-      <w:r>
-        <w:t xml:space="preserve"> al </w:t>
-      </w:r>
-      <w:r>
-        <w:t xml:space="preserve">2023) </w:t>
+        <w:t xml:space="preserve"> (dal 2016 al 2023) </w:t>
       </w:r>
       <w:r>
         <w:t>in un'unica tabella (</w:t>
@@ -472,22 +509,7 @@
         <w:t>)</w:t>
       </w:r>
       <w:r>
-        <w:t xml:space="preserve"> </w:t>
-      </w:r>
-      <w:r>
-        <w:t>manten</w:t>
-      </w:r>
-      <w:r>
-        <w:t>endo solo</w:t>
-      </w:r>
-      <w:r>
-        <w:t xml:space="preserve"> le colonne essenziali</w:t>
-      </w:r>
-      <w:r>
-        <w:t xml:space="preserve"> per l’analisi</w:t>
-      </w:r>
-      <w:r>
-        <w:t xml:space="preserve">: </w:t>
+        <w:t xml:space="preserve"> mantenendo solo le colonne essenziali per l’analisi: </w:t>
       </w:r>
       <w:proofErr w:type="spellStart"/>
       <w:r>
@@ -570,6 +592,7 @@
         <w:jc w:val="both"/>
       </w:pPr>
       <w:r>
+        <w:lastRenderedPageBreak/>
         <w:t>La tabella salvata come file .</w:t>
       </w:r>
       <w:proofErr w:type="spellStart"/>
@@ -608,7 +631,6 @@
         <w:jc w:val="both"/>
       </w:pPr>
       <w:r>
-        <w:lastRenderedPageBreak/>
         <w:t>3. Metriche e filtri principali</w:t>
       </w:r>
       <w:r>
@@ -692,13 +714,7 @@
         <w:jc w:val="both"/>
       </w:pPr>
       <w:r>
-        <w:t xml:space="preserve">Misura la quota del punteggio totale attribuibile al televoto. Alimenta </w:t>
-      </w:r>
-      <w:r>
-        <w:t>il grafico a punteggio</w:t>
-      </w:r>
-      <w:r>
-        <w:t xml:space="preserve"> “</w:t>
+        <w:t>Misura la quota del punteggio totale attribuibile al televoto. Alimenta il grafico a punteggio “</w:t>
       </w:r>
       <w:proofErr w:type="spellStart"/>
       <w:r>
@@ -706,10 +722,7 @@
       </w:r>
       <w:proofErr w:type="spellEnd"/>
       <w:r>
-        <w:t xml:space="preserve"> Impact on Total Score” (84%), formattata come percentuale</w:t>
-      </w:r>
-      <w:r>
-        <w:t>.</w:t>
+        <w:t xml:space="preserve"> Impact on Total Score” (84%), formattata come percentuale.</w:t>
       </w:r>
     </w:p>
     <w:p>
@@ -848,14 +861,7 @@
           <w:b/>
           <w:bCs/>
         </w:rPr>
-        <w:t>23</w:t>
-      </w:r>
-      <w:r>
-        <w:rPr>
-          <w:b/>
-          <w:bCs/>
-        </w:rPr>
-        <w:t>”</w:t>
+        <w:t>23”</w:t>
       </w:r>
       <w:r>
         <w:rPr>
@@ -865,19 +871,7 @@
         <w:t xml:space="preserve"> </w:t>
       </w:r>
       <w:r>
-        <w:t>(</w:t>
-      </w:r>
-      <w:r>
-        <w:t xml:space="preserve">realizzato in modo analogo per calcolare il </w:t>
-      </w:r>
-      <w:r>
-        <w:t>punteggio dell’anno che segna l</w:t>
-      </w:r>
-      <w:r>
-        <w:t>a fine</w:t>
-      </w:r>
-      <w:r>
-        <w:t xml:space="preserve"> dell’analisi temporale)</w:t>
+        <w:t>(realizzato in modo analogo per calcolare il punteggio dell’anno che segna la fine dell’analisi temporale)</w:t>
       </w:r>
       <w:r>
         <w:t xml:space="preserve"> </w:t>
@@ -955,13 +949,7 @@
         <w:jc w:val="both"/>
       </w:pPr>
       <w:r>
-        <w:t xml:space="preserve">Misura la variazione percentuale del punteggio dell'Italia tra il 2016 e il 2023. Alimenta </w:t>
-      </w:r>
-      <w:r>
-        <w:t>il grafico a punteggio</w:t>
-      </w:r>
-      <w:r>
-        <w:t xml:space="preserve"> “</w:t>
+        <w:t>Misura la variazione percentuale del punteggio dell'Italia tra il 2016 e il 2023. Alimenta il grafico a punteggio “</w:t>
       </w:r>
       <w:proofErr w:type="spellStart"/>
       <w:r>
@@ -977,13 +965,7 @@
       </w:r>
       <w:proofErr w:type="spellEnd"/>
       <w:r>
-        <w:t xml:space="preserve"> 2016”</w:t>
-      </w:r>
-      <w:r>
-        <w:t xml:space="preserve">, </w:t>
-      </w:r>
-      <w:r>
-        <w:t>formattata come percentuale a 0 decimali.</w:t>
+        <w:t xml:space="preserve"> 2016”, formattata come percentuale a 0 decimali.</w:t>
       </w:r>
     </w:p>
     <w:p>
@@ -1062,14 +1044,7 @@
           <w:b/>
           <w:bCs/>
         </w:rPr>
-        <w:t>P</w:t>
-      </w:r>
-      <w:r>
-        <w:rPr>
-          <w:b/>
-          <w:bCs/>
-        </w:rPr>
-        <w:t>ositive_</w:t>
+        <w:t>Positive_</w:t>
       </w:r>
       <w:proofErr w:type="gramStart"/>
       <w:r>
@@ -1389,6 +1364,7 @@
           <w:b/>
           <w:bCs/>
         </w:rPr>
+        <w:lastRenderedPageBreak/>
         <w:t>Filtro “</w:t>
       </w:r>
       <w:proofErr w:type="spellStart"/>
@@ -1459,7 +1435,6 @@
           <w:b/>
           <w:bCs/>
         </w:rPr>
-        <w:lastRenderedPageBreak/>
         <w:t>Filtri interattivi</w:t>
       </w:r>
       <w:r>
@@ -1565,13 +1540,7 @@
       </w:r>
       <w:proofErr w:type="spellEnd"/>
       <w:r>
-        <w:t xml:space="preserve">” utilizzato come </w:t>
-      </w:r>
-      <w:r>
-        <w:t xml:space="preserve">cursore di controllo </w:t>
-      </w:r>
-      <w:r>
-        <w:t xml:space="preserve">di visualizzazione per classificazione finale (fino a posizione 26). </w:t>
+        <w:t xml:space="preserve">” utilizzato come cursore di controllo di visualizzazione per classificazione finale (fino a posizione 26). </w:t>
       </w:r>
     </w:p>
     <w:p>
@@ -1600,21 +1569,7 @@
           <w:b/>
           <w:bCs/>
         </w:rPr>
-        <w:t xml:space="preserve"> </w:t>
-      </w:r>
-      <w:r>
-        <w:rPr>
-          <w:b/>
-          <w:bCs/>
-        </w:rPr>
-        <w:t>seconda</w:t>
-      </w:r>
-      <w:r>
-        <w:rPr>
-          <w:b/>
-          <w:bCs/>
-        </w:rPr>
-        <w:t xml:space="preserve"> pagina</w:t>
+        <w:t xml:space="preserve"> seconda pagina</w:t>
       </w:r>
       <w:r>
         <w:rPr>
@@ -1756,7 +1711,7 @@
                     <pic:cNvPicPr/>
                   </pic:nvPicPr>
                   <pic:blipFill>
-                    <a:blip r:embed="rId5" cstate="print">
+                    <a:blip r:embed="rId6" cstate="print">
                       <a:extLst>
                         <a:ext uri="{28A0092B-C50C-407E-A947-70E740481C1C}">
                           <a14:useLocalDpi xmlns:a14="http://schemas.microsoft.com/office/drawing/2010/main" val="0"/>
@@ -1829,111 +1784,66 @@
       <w:pPr>
         <w:pStyle w:val="Heading2"/>
         <w:jc w:val="both"/>
-        <w:rPr>
-          <w:lang w:val="en-US"/>
-        </w:rPr>
       </w:pPr>
     </w:p>
     <w:p>
       <w:pPr>
         <w:pStyle w:val="Heading2"/>
         <w:jc w:val="both"/>
-        <w:rPr>
-          <w:lang w:val="en-US"/>
-        </w:rPr>
       </w:pPr>
     </w:p>
     <w:p>
       <w:pPr>
         <w:pStyle w:val="Heading2"/>
         <w:jc w:val="both"/>
-        <w:rPr>
-          <w:lang w:val="en-US"/>
-        </w:rPr>
       </w:pPr>
     </w:p>
     <w:p>
       <w:pPr>
         <w:pStyle w:val="Heading2"/>
         <w:jc w:val="both"/>
-        <w:rPr>
-          <w:lang w:val="en-US"/>
-        </w:rPr>
       </w:pPr>
     </w:p>
     <w:p>
       <w:pPr>
         <w:pStyle w:val="Heading2"/>
         <w:jc w:val="both"/>
-        <w:rPr>
-          <w:lang w:val="en-US"/>
-        </w:rPr>
       </w:pPr>
     </w:p>
     <w:p>
       <w:pPr>
         <w:pStyle w:val="Heading2"/>
         <w:jc w:val="both"/>
-        <w:rPr>
-          <w:lang w:val="en-US"/>
-        </w:rPr>
       </w:pPr>
     </w:p>
     <w:p>
       <w:pPr>
         <w:pStyle w:val="Heading2"/>
         <w:jc w:val="both"/>
-        <w:rPr>
-          <w:lang w:val="en-US"/>
-        </w:rPr>
       </w:pPr>
     </w:p>
     <w:p>
       <w:pPr>
         <w:pStyle w:val="Heading2"/>
         <w:jc w:val="both"/>
-        <w:rPr>
-          <w:lang w:val="en-US"/>
-        </w:rPr>
       </w:pPr>
     </w:p>
     <w:p>
       <w:pPr>
         <w:pStyle w:val="Heading2"/>
         <w:jc w:val="both"/>
-        <w:rPr>
-          <w:lang w:val="en-US"/>
-        </w:rPr>
       </w:pPr>
     </w:p>
     <w:p>
       <w:pPr>
         <w:pStyle w:val="Heading2"/>
         <w:jc w:val="both"/>
-        <w:rPr>
-          <w:lang w:val="en-US"/>
-        </w:rPr>
-      </w:pPr>
-      <w:proofErr w:type="spellStart"/>
-      <w:r>
-        <w:rPr>
-          <w:lang w:val="en-US"/>
-        </w:rPr>
-        <w:lastRenderedPageBreak/>
+      </w:pPr>
+      <w:r>
         <w:t>P</w:t>
       </w:r>
       <w:r>
-        <w:rPr>
-          <w:lang w:val="en-US"/>
-        </w:rPr>
-        <w:t>agina</w:t>
-      </w:r>
-      <w:proofErr w:type="spellEnd"/>
-      <w:r>
-        <w:rPr>
-          <w:lang w:val="en-US"/>
-        </w:rPr>
-        <w:t xml:space="preserve"> 2 — Italy vs Other Countries</w:t>
+        <w:t>agina 2 — Italy vs Other Countries</w:t>
       </w:r>
     </w:p>
     <w:p>
@@ -1978,7 +1888,7 @@
                     <pic:cNvPicPr/>
                   </pic:nvPicPr>
                   <pic:blipFill>
-                    <a:blip r:embed="rId6" cstate="print">
+                    <a:blip r:embed="rId7" cstate="print">
                       <a:extLst>
                         <a:ext uri="{28A0092B-C50C-407E-A947-70E740481C1C}">
                           <a14:useLocalDpi xmlns:a14="http://schemas.microsoft.com/office/drawing/2010/main" val="0"/>
@@ -2162,6 +2072,7 @@
           <w:b/>
           <w:bCs/>
         </w:rPr>
+        <w:lastRenderedPageBreak/>
         <w:t xml:space="preserve">In sintesi. </w:t>
       </w:r>
       <w:r>
@@ -3114,6 +3025,30 @@
       <w:szCs w:val="20"/>
     </w:rPr>
   </w:style>
+  <w:style w:type="character" w:styleId="UnresolvedMention">
+    <w:name w:val="Unresolved Mention"/>
+    <w:basedOn w:val="DefaultParagraphFont"/>
+    <w:uiPriority w:val="99"/>
+    <w:semiHidden/>
+    <w:unhideWhenUsed/>
+    <w:rsid w:val="007018F8"/>
+    <w:rPr>
+      <w:color w:val="605E5C"/>
+      <w:shd w:val="clear" w:color="auto" w:fill="E1DFDD"/>
+    </w:rPr>
+  </w:style>
+  <w:style w:type="character" w:styleId="FollowedHyperlink">
+    <w:name w:val="FollowedHyperlink"/>
+    <w:basedOn w:val="DefaultParagraphFont"/>
+    <w:uiPriority w:val="99"/>
+    <w:semiHidden/>
+    <w:unhideWhenUsed/>
+    <w:rsid w:val="006A75FD"/>
+    <w:rPr>
+      <w:color w:val="96607D" w:themeColor="followedHyperlink"/>
+      <w:u w:val="single"/>
+    </w:rPr>
+  </w:style>
 </w:styles>
 </file>
 

</xml_diff>